<commit_message>
Hawthorn Rd Rev G: Sunny Lotay in core team, review allowance
Co-Authored-By: Claude Opus 5.5 <noreply@anthropic.com>
Claude-Session: https://claude.ai/code/session_01RKGFyarCMuMinKYL7AiBap
</commit_message>
<xml_diff>
--- a/FP/BUYNSW-T026-2026/Final/JCE_FP_BUYNSW-T026-2026_to_Architect_Final_RevG.docx
+++ b/FP/BUYNSW-T026-2026/Final/JCE_FP_BUYNSW-T026-2026_to_Architect_Final_RevG.docx
@@ -434,7 +434,7 @@
     </w:p>
     <w:p>
       <w:r>
-        <w:t>JCE Infrastructure Pty Ltd (JCE) offers this fee proposal for the civil engineering services in your team for Camden Council's RFT T026/2026, Design Consultancy Services for the Leppington Community Centre Precinct. JCE's civil design will be led and signed off by Jayden Callen personally, who will be your single point of contact. Jayden's background is multidisciplinary design management: coordinating civil, services and specialist inputs into one package to one program, including clash checking of consultant models in Civil 3D and Navisworks on a $250 million Defence facility. He has also shortlisted consultants for a council RFT, so he knows what a council panel looks for.</w:t>
+        <w:t>JCE Infrastructure Pty Ltd (JCE) offers this fee proposal for the civil engineering services in your team for Camden Council's RFT T026/2026, Design Consultancy Services for the Leppington Community Centre Precinct. JCE's civil design will be led by Jayden Callen personally, who will be your single point of contact, with technical review and certification by Sunny Lotay (RPEQ, NER), JCE's associate certifying engineer. Jayden's background is multidisciplinary design management: coordinating civil, services and specialist inputs into one package to one program, including clash checking of consultant models in Civil 3D and Navisworks on a $250 million Defence facility. He has also shortlisted consultants for a council RFT, so he knows what a council panel looks for.</w:t>
       </w:r>
     </w:p>
     <w:p>
@@ -839,7 +839,7 @@
         <w:spacing w:after="40"/>
       </w:pPr>
       <w:r>
-        <w:t>Review before issue: every civil issue is checked by Jayden, and the levels, earthworks and stormwater design are independently reviewed by Livio Chiarot FIEAust before each major milestone. JCE provides the written attestation of senior review and cross-checking required by Vol 4 s15 at each issue.</w:t>
+        <w:t>Review before issue: every civil issue is checked by Jayden and technically reviewed by Sunny Lotay (RPEQ, NER) before release, and the levels, earthworks and stormwater design are independently peer reviewed by Livio Chiarot FIEAust before each major milestone. JCE provides the written attestation of senior review and cross-checking required by Vol 4 s15 at each issue.</w:t>
       </w:r>
     </w:p>
     <w:p>
@@ -1890,17 +1890,22 @@
     </w:p>
     <w:p>
       <w:r>
+        <w:t>Sunny Lotay, Associate Principal Engineer (RPEQ, NER), Lotay Civil: engaged by JCE under a standing associate agreement as technical reviewer and certifying engineer on JCE commissions. On this commission Sunny will review the civil design outputs before each major issue, certify the civil design and construction-stage certification, and act as backup project lead.</w:t>
+      </w:r>
+    </w:p>
+    <w:p>
+      <w:r>
         <w:t>Livio Chiarot FIEAust, Director, SCP Consulting: independent technical peer review of the levels, earthworks and stormwater documentation before each major issue (reviewer, not certifier). Livio has more than 40 years in civil, hydraulic and fire services engineering.</w:t>
       </w:r>
     </w:p>
     <w:p>
       <w:r>
-        <w:t>Additional design and drafting resources: [TBC - Jayden]. The fee is built from about 530 hours across the Director, Senior Engineer, Project Engineer, Design Engineer and CAD roles at JCE's Schedule of Rates. Name any second team member for Schedule 6 only once availability is confirmed.</w:t>
+        <w:t>Additional design and drafting resources: [TBC - Jayden]. The fee is built from about 530 hours across the Director, Senior Engineer, Project Engineer, Design Engineer and CAD roles at JCE's Schedule of Rates, plus 16 hours of associate review and certification by Sunny Lotay. Name any second team member for Schedule 6 only once availability is confirmed.</w:t>
       </w:r>
     </w:p>
     <w:p>
       <w:r>
-        <w:t>Sign-off. This is NSW work for a Class 9b community building. RPEQ does not apply, and the tender does not ask for a particular engineering registration. Civil design certification will be issued by Jayden Callen (MIEAust) with independent peer review. If Council asks for CPEng verification of any element, it is available as a provisional sum (Section 8.0).</w:t>
+        <w:t>Sign-off. This is NSW work for a Class 9b community building. RPEQ does not apply, and the tender does not ask for a particular engineering registration. Civil design certification will be provided by Sunny Lotay (RPEQ, NER) as JCE's associate certifying engineer, with the design led by Jayden Callen (MIEAust, NER application in progress) and independent peer review by Livio Chiarot. If Council asks for CPEng verification of any element, it is available as a provisional sum (Section 8.0).</w:t>
       </w:r>
     </w:p>
     <w:p>
@@ -2334,7 +2339,7 @@
               <w:rPr>
                 <w:sz w:val="17"/>
               </w:rPr>
-              <w:t>$39,110.00</w:t>
+              <w:t>$39,990.00</w:t>
             </w:r>
           </w:p>
         </w:tc>
@@ -2391,7 +2396,7 @@
               <w:rPr>
                 <w:sz w:val="17"/>
               </w:rPr>
-              <w:t>$19,100.00</w:t>
+              <w:t>$19,980.00</w:t>
             </w:r>
           </w:p>
         </w:tc>
@@ -2448,7 +2453,7 @@
               <w:rPr>
                 <w:sz w:val="17"/>
               </w:rPr>
-              <w:t>$27,420.00</w:t>
+              <w:t>$28,740.00</w:t>
             </w:r>
           </w:p>
         </w:tc>
@@ -2505,7 +2510,7 @@
               <w:rPr>
                 <w:sz w:val="17"/>
               </w:rPr>
-              <w:t>$15,020.00</w:t>
+              <w:t>$15,460.00</w:t>
             </w:r>
           </w:p>
         </w:tc>
@@ -2547,7 +2552,7 @@
                 <w:b/>
                 <w:sz w:val="17"/>
               </w:rPr>
-              <w:t>Civil total (excl. GST)</w:t>
+              <w:t>Civil total (excl. GST), including $3,520 associate review and certification allowance (Sunny Lotay)</w:t>
             </w:r>
           </w:p>
         </w:tc>
@@ -2567,7 +2572,7 @@
                 <w:b/>
                 <w:sz w:val="17"/>
               </w:rPr>
-              <w:t>$100,650.00</w:t>
+              <w:t>$104,170.00</w:t>
             </w:r>
           </w:p>
         </w:tc>
@@ -2629,7 +2634,7 @@
                 <w:b/>
                 <w:sz w:val="17"/>
               </w:rPr>
-              <w:t>$10,065.00</w:t>
+              <w:t>$10,417.00</w:t>
             </w:r>
           </w:p>
         </w:tc>
@@ -2688,7 +2693,7 @@
                 <w:b/>
                 <w:sz w:val="17"/>
               </w:rPr>
-              <w:t>$110,715.00</w:t>
+              <w:t>$114,587.00</w:t>
             </w:r>
           </w:p>
         </w:tc>
@@ -2698,6 +2703,11 @@
       <w:pPr>
         <w:spacing w:after="40"/>
       </w:pPr>
+    </w:p>
+    <w:p>
+      <w:r>
+        <w:t>The phase fees include an associate review and certification allowance for Sunny Lotay (RPEQ, NER) of 16 hours at $200 per hour plus JCE's 10% sub-consultant margin: Phase 1 $880 (Early Bulk Earthworks DA review), Phase 2 $880 (50% review), Phase 3 $1,320 (100% review and design certification), Phase 4 $440 (construction certification); $3,520 in total.</w:t>
+      </w:r>
     </w:p>
     <w:p>
       <w:pPr>
@@ -3382,7 +3392,7 @@
               <w:rPr>
                 <w:sz w:val="17"/>
               </w:rPr>
-              <w:t>$39,110</w:t>
+              <w:t>$39,990</w:t>
             </w:r>
           </w:p>
         </w:tc>
@@ -3399,7 +3409,7 @@
               <w:rPr>
                 <w:sz w:val="17"/>
               </w:rPr>
-              <w:t>$19,100</w:t>
+              <w:t>$19,980</w:t>
             </w:r>
           </w:p>
         </w:tc>
@@ -3416,7 +3426,7 @@
               <w:rPr>
                 <w:sz w:val="17"/>
               </w:rPr>
-              <w:t>$27,420</w:t>
+              <w:t>$28,740</w:t>
             </w:r>
           </w:p>
         </w:tc>
@@ -3433,7 +3443,7 @@
               <w:rPr>
                 <w:sz w:val="17"/>
               </w:rPr>
-              <w:t>$15,020</w:t>
+              <w:t>$15,460</w:t>
             </w:r>
           </w:p>
         </w:tc>
@@ -3451,7 +3461,7 @@
               <w:rPr>
                 <w:sz w:val="17"/>
               </w:rPr>
-              <w:t>$100,650</w:t>
+              <w:t>$104,170</w:t>
             </w:r>
           </w:p>
         </w:tc>
@@ -3600,7 +3610,7 @@
                 <w:b/>
                 <w:sz w:val="17"/>
               </w:rPr>
-              <w:t>$43,590</w:t>
+              <w:t>$44,470</w:t>
             </w:r>
           </w:p>
         </w:tc>
@@ -3618,7 +3628,7 @@
                 <w:b/>
                 <w:sz w:val="17"/>
               </w:rPr>
-              <w:t>$26,680</w:t>
+              <w:t>$27,560</w:t>
             </w:r>
           </w:p>
         </w:tc>
@@ -3636,7 +3646,7 @@
                 <w:b/>
                 <w:sz w:val="17"/>
               </w:rPr>
-              <w:t>$36,540</w:t>
+              <w:t>$37,860</w:t>
             </w:r>
           </w:p>
         </w:tc>
@@ -3654,7 +3664,7 @@
                 <w:b/>
                 <w:sz w:val="17"/>
               </w:rPr>
-              <w:t>$21,340</w:t>
+              <w:t>$21,780</w:t>
             </w:r>
           </w:p>
         </w:tc>
@@ -3673,7 +3683,7 @@
                 <w:b/>
                 <w:sz w:val="17"/>
               </w:rPr>
-              <w:t>$128,150</w:t>
+              <w:t>$131,670</w:t>
             </w:r>
           </w:p>
         </w:tc>
@@ -3788,6 +3798,63 @@
                 <w:sz w:val="17"/>
               </w:rPr>
               <w:t>Jayden Callen, Director and Principal Civil Engineer</w:t>
+            </w:r>
+          </w:p>
+        </w:tc>
+        <w:tc>
+          <w:tcPr>
+            <w:tcW w:type="dxa" w:w="1701"/>
+          </w:tcPr>
+          <w:p>
+            <w:pPr>
+              <w:keepNext/>
+              <w:spacing w:after="20"/>
+            </w:pPr>
+            <w:r>
+              <w:rPr>
+                <w:sz w:val="17"/>
+              </w:rPr>
+              <w:t>$200</w:t>
+            </w:r>
+          </w:p>
+        </w:tc>
+        <w:tc>
+          <w:tcPr>
+            <w:tcW w:type="dxa" w:w="2268"/>
+          </w:tcPr>
+          <w:p>
+            <w:pPr>
+              <w:keepNext/>
+              <w:spacing w:after="20"/>
+              <w:jc w:val="right"/>
+            </w:pPr>
+            <w:r>
+              <w:rPr>
+                <w:sz w:val="17"/>
+              </w:rPr>
+              <w:t>$1,900</w:t>
+            </w:r>
+          </w:p>
+        </w:tc>
+      </w:tr>
+      <w:tr>
+        <w:trPr>
+          <w:cantSplit/>
+        </w:trPr>
+        <w:tc>
+          <w:tcPr>
+            <w:tcW w:type="dxa" w:w="5386"/>
+          </w:tcPr>
+          <w:p>
+            <w:pPr>
+              <w:keepNext/>
+              <w:spacing w:after="20"/>
+            </w:pPr>
+            <w:r>
+              <w:rPr>
+                <w:sz w:val="17"/>
+              </w:rPr>
+              <w:t>Sunny Lotay, Associate Principal Engineer (RPEQ, NER), Lotay Civil</w:t>
             </w:r>
           </w:p>
         </w:tc>
@@ -5721,7 +5788,7 @@
     </w:p>
     <w:p>
       <w:r>
-        <w:t>Civil: Phase 1 $39,110; Phase 2 $19,100; Phase 3 $27,420; Phase 4 $15,020; total $100,650 excl. GST. Hydraulics (if JCE is engaged for it): Phase 1 $4,480; Phase 2 $7,580; Phase 3 $9,120; Phase 4 $6,320; total $27,500 excl. GST. Rates as in Section 8.0. Fixed site inspection fee $1,900 excl. GST including travel and report.</w:t>
+        <w:t>Civil: Phase 1 $39,990; Phase 2 $19,980; Phase 3 $28,740; Phase 4 $15,460; total $104,170 excl. GST (includes the $3,520 associate review and certification allowance). Hydraulics (if JCE is engaged for it): Phase 1 $4,480; Phase 2 $7,580; Phase 3 $9,120; Phase 4 $6,320; total $27,500 excl. GST. Rates as in Section 8.0. Fixed site inspection fee $1,900 excl. GST including travel and report.</w:t>
       </w:r>
     </w:p>
     <w:p>
@@ -8901,7 +8968,7 @@
               <w:rPr>
                 <w:sz w:val="17"/>
               </w:rPr>
-              <w:t>Director and Principal Civil Engineer, JCE (civil lead and sign-off)</w:t>
+              <w:t>Director and Principal Civil Engineer, JCE (civil lead)</w:t>
             </w:r>
           </w:p>
         </w:tc>
@@ -8967,6 +9034,7 @@
           </w:tcPr>
           <w:p>
             <w:pPr>
+              <w:keepNext/>
               <w:spacing w:after="20"/>
             </w:pPr>
             <w:r>
@@ -8974,6 +9042,112 @@
                 <w:sz w:val="17"/>
               </w:rPr>
               <w:t>2</w:t>
+            </w:r>
+          </w:p>
+        </w:tc>
+        <w:tc>
+          <w:tcPr>
+            <w:tcW w:type="dxa" w:w="1417"/>
+          </w:tcPr>
+          <w:p>
+            <w:pPr>
+              <w:keepNext/>
+              <w:spacing w:after="20"/>
+            </w:pPr>
+            <w:r>
+              <w:rPr>
+                <w:sz w:val="17"/>
+              </w:rPr>
+              <w:t>Sunny Lotay</w:t>
+            </w:r>
+          </w:p>
+        </w:tc>
+        <w:tc>
+          <w:tcPr>
+            <w:tcW w:type="dxa" w:w="1984"/>
+          </w:tcPr>
+          <w:p>
+            <w:pPr>
+              <w:keepNext/>
+              <w:spacing w:after="20"/>
+            </w:pPr>
+            <w:r>
+              <w:rPr>
+                <w:sz w:val="17"/>
+              </w:rPr>
+              <w:t>Associate Principal Engineer, Lotay Civil: technical reviewer, certifying engineer and backup project lead under a standing associate agreement with JCE</w:t>
+            </w:r>
+          </w:p>
+        </w:tc>
+        <w:tc>
+          <w:tcPr>
+            <w:tcW w:type="dxa" w:w="1814"/>
+          </w:tcPr>
+          <w:p>
+            <w:pPr>
+              <w:keepNext/>
+              <w:spacing w:after="20"/>
+            </w:pPr>
+            <w:r>
+              <w:rPr>
+                <w:sz w:val="17"/>
+              </w:rPr>
+              <w:t>RPEQ, NER</w:t>
+            </w:r>
+          </w:p>
+        </w:tc>
+        <w:tc>
+          <w:tcPr>
+            <w:tcW w:type="dxa" w:w="2438"/>
+          </w:tcPr>
+          <w:p>
+            <w:pPr>
+              <w:keepNext/>
+              <w:spacing w:after="20"/>
+            </w:pPr>
+            <w:r>
+              <w:rPr>
+                <w:sz w:val="17"/>
+              </w:rPr>
+              <w:t>Technical review and certification on JCE commissions</w:t>
+            </w:r>
+          </w:p>
+        </w:tc>
+        <w:tc>
+          <w:tcPr>
+            <w:tcW w:type="dxa" w:w="1134"/>
+          </w:tcPr>
+          <w:p>
+            <w:pPr>
+              <w:keepNext/>
+              <w:spacing w:after="20"/>
+            </w:pPr>
+            <w:r>
+              <w:rPr>
+                <w:sz w:val="17"/>
+              </w:rPr>
+              <w:t>Review and certification at each major issue (16 hours allowed)</w:t>
+            </w:r>
+          </w:p>
+        </w:tc>
+      </w:tr>
+      <w:tr>
+        <w:trPr>
+          <w:cantSplit/>
+        </w:trPr>
+        <w:tc>
+          <w:tcPr>
+            <w:tcW w:type="dxa" w:w="567"/>
+          </w:tcPr>
+          <w:p>
+            <w:pPr>
+              <w:spacing w:after="20"/>
+            </w:pPr>
+            <w:r>
+              <w:rPr>
+                <w:sz w:val="17"/>
+              </w:rPr>
+              <w:t>3</w:t>
             </w:r>
           </w:p>
         </w:tc>
@@ -9071,7 +9245,7 @@
     </w:p>
     <w:p>
       <w:r>
-        <w:t>Organisation chart entry: Lead Architect &gt; Civil Engineer: JCE Infrastructure (Jayden Callen, civil lead) &gt; independent peer review: Livio Chiarot FIEAust; hydraulics (if engaged): JCE Infrastructure.</w:t>
+        <w:t>Organisation chart entry: Lead Architect &gt; Civil Engineer: JCE Infrastructure core team (Jayden Callen, civil lead; Sunny Lotay RPEQ NER, associate certifying engineer and backup lead) &gt; independent peer review: Livio Chiarot FIEAust; hydraulics (if engaged): JCE Infrastructure.</w:t>
       </w:r>
     </w:p>
     <w:p>

</xml_diff>